<commit_message>
Guion: citar fuentes en voz alta y aclarar cifras
Co-Authored-By: Claude Opus 5.5 <noreply@anthropic.com>
Claude-Session: https://claude.ai/code/session_01L6Rz1XLkN8EZi73oRofqBs
</commit_message>
<xml_diff>
--- a/presentacion/Guion_CorreosChile.docx
+++ b/presentacion/Guion_CorreosChile.docx
@@ -28,7 +28,7 @@
           <w:sz w:val="22"/>
           <w:szCs w:val="22"/>
         </w:rPr>
-        <w:t xml:space="preserve"> ≈ 3:40 min (máximo 4:00)</w:t>
+        <w:t xml:space="preserve"> ≈ 3:45 min (máximo 4:00)</w:t>
       </w:r>
     </w:p>
     <w:p>
@@ -104,7 +104,7 @@
           <w:sz w:val="24"/>
           <w:szCs w:val="24"/>
         </w:rPr>
-        <w:t xml:space="preserve">Esa pregunta es el centro de nuestro análisis. Somos Álvaro Quintero y Brando Barreto, de la carrera de Finanzas. CorreosChile es una empresa del Estado desde 1981, con cerca de 4.700 trabajadores y unas 200 sucursales, de Arica a la Antártica. Hoy veremos cómo el trabajo híbrido afecta sus espacios y sus procesos administrativos.</w:t>
+        <w:t xml:space="preserve">Esa pregunta es el centro de nuestro análisis. Somos Álvaro Quintero y Brando Barreto, de la carrera de Finanzas. Según su Memoria Anual y sus estados financieros 2024, CorreosChile es una empresa del Estado creada en 1981, con cerca de 4.700 trabajadores y unas 200 sucursales, de Arica a la Antártica. Hoy veremos cómo el trabajo híbrido afecta sus espacios y sus procesos administrativos.</w:t>
       </w:r>
     </w:p>
     <w:p>
@@ -119,7 +119,7 @@
           <w:sz w:val="20"/>
           <w:szCs w:val="20"/>
         </w:rPr>
-        <w:t xml:space="preserve">Gesto: pausa de 2 segundos después de la pregunta.</w:t>
+        <w:t xml:space="preserve">Gesto: pausa de 2 segundos después de la pregunta. La escena del lunes y el viernes es una imagen para abrir, no un dato: no la presenten como estadística.</w:t>
       </w:r>
     </w:p>
     <w:p>
@@ -158,7 +158,7 @@
           <w:sz w:val="24"/>
           <w:szCs w:val="24"/>
         </w:rPr>
-        <w:t xml:space="preserve">El problema es este: las oficinas están pensadas para cinco días, pero los equipos hoy van tres o cuatro.</w:t>
+        <w:t xml:space="preserve">El problema es este: las oficinas están pensadas para cinco días, pero, como veremos en los datos, los equipos hoy van tres o cuatro.</w:t>
       </w:r>
     </w:p>
     <w:p>
@@ -261,39 +261,55 @@
           <w:sz w:val="20"/>
           <w:szCs w:val="20"/>
         </w:rPr>
-        <w:t xml:space="preserve">Álvaro, 1:05 – 1:50</w:t>
-      </w:r>
-    </w:p>
-    <w:p>
-      <w:pPr>
-        <w:pBdr>
-          <w:left w:val="single" w:color="0B2545" w:sz="12" w:space="10"/>
-        </w:pBdr>
-        <w:spacing w:after="140" w:line="320"/>
-        <w:ind w:left="360"/>
-      </w:pPr>
-      <w:r>
-        <w:rPr>
-          <w:sz w:val="24"/>
-          <w:szCs w:val="24"/>
-        </w:rPr>
-        <w:t xml:space="preserve">Según la encuesta 2025 de Robert Half Chile, el 49% de las empresas usa un modelo híbrido con días fijos y un 38% deja que el trabajador elija. Solo un 13% volvió a la presencialidad total, y ninguna trabaja cien por ciento remoto.</w:t>
-      </w:r>
-    </w:p>
-    <w:p>
-      <w:pPr>
-        <w:pBdr>
-          <w:left w:val="single" w:color="0B2545" w:sz="12" w:space="10"/>
-        </w:pBdr>
-        <w:spacing w:after="140" w:line="320"/>
-        <w:ind w:left="360"/>
-      </w:pPr>
-      <w:r>
-        <w:rPr>
-          <w:sz w:val="24"/>
-          <w:szCs w:val="24"/>
-        </w:rPr>
-        <w:t xml:space="preserve">En suma, el </w:t>
+        <w:t xml:space="preserve">Álvaro, 1:05 – 1:55</w:t>
+      </w:r>
+    </w:p>
+    <w:p>
+      <w:pPr>
+        <w:pBdr>
+          <w:left w:val="single" w:color="0B2545" w:sz="12" w:space="10"/>
+        </w:pBdr>
+        <w:spacing w:after="140" w:line="320"/>
+        <w:ind w:left="360"/>
+      </w:pPr>
+      <w:r>
+        <w:rPr>
+          <w:sz w:val="24"/>
+          <w:szCs w:val="24"/>
+        </w:rPr>
+        <w:t xml:space="preserve">Nuestro dato viene de la encuesta de modelos de trabajo 2025 de la consultora </w:t>
+      </w:r>
+      <w:r>
+        <w:rPr>
+          <w:b/>
+          <w:bCs/>
+          <w:sz w:val="24"/>
+          <w:szCs w:val="24"/>
+        </w:rPr>
+        <w:t xml:space="preserve">Robert Half Chile</w:t>
+      </w:r>
+      <w:r>
+        <w:rPr>
+          <w:sz w:val="24"/>
+          <w:szCs w:val="24"/>
+        </w:rPr>
+        <w:t xml:space="preserve">, publicada por Emol y El Mostrador en mayo de 2025. Según ella, el 49% de las empresas usa un modelo híbrido con días fijos y un 38% deja que el trabajador elija. Solo un 13% volvió a la presencialidad total, y ninguna trabaja cien por ciento remoto.</w:t>
+      </w:r>
+    </w:p>
+    <w:p>
+      <w:pPr>
+        <w:pBdr>
+          <w:left w:val="single" w:color="0B2545" w:sz="12" w:space="10"/>
+        </w:pBdr>
+        <w:spacing w:after="140" w:line="320"/>
+        <w:ind w:left="360"/>
+      </w:pPr>
+      <w:r>
+        <w:rPr>
+          <w:sz w:val="24"/>
+          <w:szCs w:val="24"/>
+        </w:rPr>
+        <w:t xml:space="preserve">Si sumamos los dos modelos híbridos, el </w:t>
       </w:r>
       <w:r>
         <w:rPr>
@@ -309,7 +325,7 @@
           <w:sz w:val="24"/>
           <w:szCs w:val="24"/>
         </w:rPr>
-        <w:t xml:space="preserve"> de las empresas en Chile ya es híbrida. Y la fórmula más común es ir cuatro días a la oficina: así lo exige el 32% de ellas.</w:t>
+        <w:t xml:space="preserve"> de las empresas en Chile ya es híbrida. Y la exigencia más común entre ellas es ir cuatro días a la oficina: así lo pide el 32%.</w:t>
       </w:r>
     </w:p>
     <w:p>
@@ -340,7 +356,7 @@
           <w:sz w:val="20"/>
           <w:szCs w:val="20"/>
         </w:rPr>
-        <w:t xml:space="preserve">Gesto: señalar la barra del 49% y luego el 87%.</w:t>
+        <w:t xml:space="preserve">Gesto: señalar la fuente al pie de la lámina, luego la barra del 49% y el 87%.</w:t>
       </w:r>
     </w:p>
     <w:p>
@@ -363,7 +379,7 @@
           <w:sz w:val="20"/>
           <w:szCs w:val="20"/>
         </w:rPr>
-        <w:t xml:space="preserve">Brando, 1:50 – 2:25</w:t>
+        <w:t xml:space="preserve">Brando, 1:55 – 2:28</w:t>
       </w:r>
     </w:p>
     <w:p>
@@ -466,7 +482,7 @@
           <w:sz w:val="20"/>
           <w:szCs w:val="20"/>
         </w:rPr>
-        <w:t xml:space="preserve">Brando, 2:25 – 2:55</w:t>
+        <w:t xml:space="preserve">Brando, 2:28 – 2:55</w:t>
       </w:r>
     </w:p>
     <w:p>
@@ -507,7 +523,7 @@
           <w:sz w:val="24"/>
           <w:szCs w:val="24"/>
         </w:rPr>
-        <w:t xml:space="preserve"> el híbrido llegó para quedarse; ya lo aplica el 87% de las empresas.</w:t>
+        <w:t xml:space="preserve"> el híbrido llegó para quedarse; según Robert Half, ya lo aplica el 87% de las empresas en Chile.</w:t>
       </w:r>
     </w:p>
     <w:p>
@@ -596,7 +612,7 @@
           <w:sz w:val="20"/>
           <w:szCs w:val="20"/>
         </w:rPr>
-        <w:t xml:space="preserve">Brando, 2:55 – 3:40</w:t>
+        <w:t xml:space="preserve">Brando, 2:55 – 3:45</w:t>
       </w:r>
     </w:p>
     <w:p>
@@ -701,7 +717,7 @@
           <w:sz w:val="24"/>
           <w:szCs w:val="24"/>
         </w:rPr>
-        <w:t xml:space="preserve">Volvamos a la pregunta del inicio: ¿cuántos escritorios quedan vacíos el viernes? Con este piloto lo sabremos, y podremos actuar.</w:t>
+        <w:t xml:space="preserve">Volvamos a la pregunta del inicio: ¿cuántos escritorios quedan vacíos el viernes? Hoy no tenemos esa cifra; con este piloto la tendremos, y podremos actuar.</w:t>
       </w:r>
     </w:p>
     <w:p>
@@ -801,6 +817,26 @@
       </w:r>
       <w:r>
         <w:t xml:space="preserve"> la última lámina repite la pregunta de la portada. Eso conecta el contexto con la conclusión (pregunta 5 de la pauta).</w:t>
+      </w:r>
+    </w:p>
+    <w:p>
+      <w:pPr>
+        <w:pStyle w:val="ListParagraph"/>
+        <w:numPr>
+          <w:ilvl w:val="0"/>
+          <w:numId w:val="2"/>
+        </w:numPr>
+        <w:spacing w:after="80"/>
+      </w:pPr>
+      <w:r>
+        <w:rPr>
+          <w:b/>
+          <w:bCs/>
+        </w:rPr>
+        <w:t xml:space="preserve">Cifras y fuentes:</w:t>
+      </w:r>
+      <w:r>
+        <w:t xml:space="preserve"> cada número dicho tiene su fuente en voz alta: Memoria Anual y estados financieros 2024 de CorreosChile (lámina 1) y encuesta Robert Half Chile 2025 (láminas 3 y 5). El 87% es una suma de 49% + 38%; si les preguntan, explíquenlo así.</w:t>
       </w:r>
     </w:p>
     <w:p>

</xml_diff>